<commit_message>
Ka irgend a update oder so
</commit_message>
<xml_diff>
--- a/D_Descriptions/projectinitiationdocument_V2.2.docx
+++ b/D_Descriptions/projectinitiationdocument_V2.2.docx
@@ -23,7 +23,7 @@
     </w:p>
     <w:p>
       <w:pPr>
-        <w:pStyle w:val="berschrift3"/>
+        <w:pStyle w:val="Heading3"/>
         <w:spacing w:before="0" w:after="0"/>
         <w:jc w:val="both"/>
       </w:pPr>
@@ -74,7 +74,7 @@
     </w:p>
     <w:p>
       <w:pPr>
-        <w:pStyle w:val="berschrift8"/>
+        <w:pStyle w:val="Heading8"/>
       </w:pPr>
       <w:r>
         <w:t>Loading the file</w:t>
@@ -120,7 +120,7 @@
     </w:p>
     <w:p>
       <w:pPr>
-        <w:pStyle w:val="berschrift8"/>
+        <w:pStyle w:val="Heading8"/>
       </w:pPr>
       <w:r>
         <w:t xml:space="preserve">Deleting the </w:t>
@@ -186,7 +186,7 @@
     </w:p>
     <w:p>
       <w:pPr>
-        <w:pStyle w:val="berschrift8"/>
+        <w:pStyle w:val="Heading8"/>
       </w:pPr>
       <w:r>
         <w:t>Saving the Project Initiation Document under its own name</w:t>
@@ -445,7 +445,7 @@
     </w:p>
     <w:p>
       <w:pPr>
-        <w:pStyle w:val="berschrift9"/>
+        <w:pStyle w:val="Heading9"/>
         <w:rPr>
           <w:lang w:val="fr-FR"/>
         </w:rPr>
@@ -1273,7 +1273,7 @@
     </w:p>
     <w:p>
       <w:pPr>
-        <w:pStyle w:val="berschrift1"/>
+        <w:pStyle w:val="Heading1"/>
         <w:rPr>
           <w:sz w:val="28"/>
           <w:szCs w:val="28"/>
@@ -1299,7 +1299,7 @@
     </w:p>
     <w:p>
       <w:pPr>
-        <w:pStyle w:val="berschrift2"/>
+        <w:pStyle w:val="Heading2"/>
         <w:rPr>
           <w:sz w:val="24"/>
           <w:szCs w:val="24"/>
@@ -1359,7 +1359,7 @@
     </w:p>
     <w:p>
       <w:pPr>
-        <w:pStyle w:val="berschrift2"/>
+        <w:pStyle w:val="Heading2"/>
         <w:rPr>
           <w:sz w:val="24"/>
           <w:szCs w:val="24"/>
@@ -1690,7 +1690,7 @@
     </w:p>
     <w:p>
       <w:pPr>
-        <w:pStyle w:val="berschrift2"/>
+        <w:pStyle w:val="Heading2"/>
         <w:rPr>
           <w:sz w:val="24"/>
           <w:szCs w:val="24"/>
@@ -1998,7 +1998,7 @@
     </w:p>
     <w:p>
       <w:pPr>
-        <w:pStyle w:val="berschrift2"/>
+        <w:pStyle w:val="Heading2"/>
         <w:rPr>
           <w:sz w:val="24"/>
           <w:szCs w:val="24"/>
@@ -2249,7 +2249,7 @@
     </w:p>
     <w:p>
       <w:pPr>
-        <w:pStyle w:val="berschrift1"/>
+        <w:pStyle w:val="Heading1"/>
         <w:jc w:val="both"/>
         <w:rPr>
           <w:sz w:val="28"/>
@@ -2323,7 +2323,7 @@
     <w:p/>
     <w:p>
       <w:pPr>
-        <w:pStyle w:val="berschrift3"/>
+        <w:pStyle w:val="Heading3"/>
         <w:spacing w:after="0"/>
         <w:ind w:left="567" w:hanging="567"/>
       </w:pPr>
@@ -2429,7 +2429,7 @@
     </w:p>
     <w:p>
       <w:pPr>
-        <w:pStyle w:val="berschrift3"/>
+        <w:pStyle w:val="Heading3"/>
         <w:ind w:left="567" w:hanging="567"/>
       </w:pPr>
       <w:r>
@@ -2470,7 +2470,7 @@
     </w:p>
     <w:p>
       <w:pPr>
-        <w:pStyle w:val="berschrift3"/>
+        <w:pStyle w:val="Heading3"/>
         <w:spacing w:after="0"/>
         <w:ind w:left="567" w:hanging="567"/>
       </w:pPr>
@@ -2905,7 +2905,7 @@
     </w:p>
     <w:p>
       <w:pPr>
-        <w:pStyle w:val="berschrift3"/>
+        <w:pStyle w:val="Heading3"/>
         <w:spacing w:after="0"/>
         <w:ind w:left="567" w:hanging="567"/>
         <w:rPr>
@@ -3331,14 +3331,16 @@
         <w:rPr>
           <w:lang w:val="en-US"/>
         </w:rPr>
-        <w:t>4.6 Nutzerinterface</w:t>
-      </w:r>
+        <w:t xml:space="preserve">4.6 </w:t>
+      </w:r>
+      <w:proofErr w:type="spellStart"/>
       <w:r>
         <w:rPr>
           <w:lang w:val="en-US"/>
         </w:rPr>
-        <w:tab/>
-      </w:r>
+        <w:t>Nutzerinterface</w:t>
+      </w:r>
+      <w:proofErr w:type="spellEnd"/>
       <w:r>
         <w:rPr>
           <w:lang w:val="en-US"/>
@@ -3391,6 +3393,12 @@
         <w:rPr>
           <w:lang w:val="en-US"/>
         </w:rPr>
+        <w:tab/>
+      </w:r>
+      <w:r>
+        <w:rPr>
+          <w:lang w:val="en-US"/>
+        </w:rPr>
         <w:t>8</w:t>
       </w:r>
     </w:p>
@@ -3405,14 +3413,16 @@
         <w:rPr>
           <w:lang w:val="en-US"/>
         </w:rPr>
-        <w:t>4.7 Versorgung</w:t>
-      </w:r>
+        <w:t xml:space="preserve">4.7 </w:t>
+      </w:r>
+      <w:proofErr w:type="spellStart"/>
       <w:r>
         <w:rPr>
           <w:lang w:val="en-US"/>
         </w:rPr>
-        <w:tab/>
-      </w:r>
+        <w:t>Versorgung</w:t>
+      </w:r>
+      <w:proofErr w:type="spellEnd"/>
       <w:r>
         <w:rPr>
           <w:lang w:val="en-US"/>
@@ -3465,12 +3475,18 @@
         <w:rPr>
           <w:lang w:val="en-US"/>
         </w:rPr>
+        <w:tab/>
+      </w:r>
+      <w:r>
+        <w:rPr>
+          <w:lang w:val="en-US"/>
+        </w:rPr>
         <w:t>8</w:t>
       </w:r>
     </w:p>
     <w:p>
       <w:pPr>
-        <w:pStyle w:val="berschrift3"/>
+        <w:pStyle w:val="Heading3"/>
         <w:ind w:left="567" w:hanging="567"/>
         <w:rPr>
           <w:lang w:val="en-US"/>
@@ -3552,7 +3568,7 @@
     </w:p>
     <w:p>
       <w:pPr>
-        <w:pStyle w:val="berschrift3"/>
+        <w:pStyle w:val="Heading3"/>
         <w:tabs>
           <w:tab w:val="left" w:pos="720"/>
           <w:tab w:val="left" w:pos="1440"/>
@@ -3586,7 +3602,7 @@
     </w:p>
     <w:p>
       <w:pPr>
-        <w:pStyle w:val="berschrift3"/>
+        <w:pStyle w:val="Heading3"/>
         <w:tabs>
           <w:tab w:val="left" w:pos="720"/>
           <w:tab w:val="left" w:pos="1440"/>
@@ -3609,7 +3625,7 @@
     </w:p>
     <w:p>
       <w:pPr>
-        <w:pStyle w:val="berschrift3"/>
+        <w:pStyle w:val="Heading3"/>
         <w:tabs>
           <w:tab w:val="left" w:pos="720"/>
           <w:tab w:val="left" w:pos="1440"/>
@@ -3634,7 +3650,7 @@
     </w:p>
     <w:p>
       <w:pPr>
-        <w:pStyle w:val="berschrift3"/>
+        <w:pStyle w:val="Heading3"/>
         <w:tabs>
           <w:tab w:val="left" w:pos="720"/>
           <w:tab w:val="left" w:pos="1440"/>
@@ -3660,7 +3676,7 @@
     </w:p>
     <w:p>
       <w:pPr>
-        <w:pStyle w:val="berschrift3"/>
+        <w:pStyle w:val="Heading3"/>
         <w:tabs>
           <w:tab w:val="left" w:pos="720"/>
           <w:tab w:val="left" w:pos="1440"/>
@@ -3685,7 +3701,7 @@
     </w:p>
     <w:p>
       <w:pPr>
-        <w:pStyle w:val="berschrift3"/>
+        <w:pStyle w:val="Heading3"/>
         <w:tabs>
           <w:tab w:val="left" w:pos="720"/>
           <w:tab w:val="left" w:pos="1440"/>
@@ -3732,7 +3748,7 @@
     </w:p>
     <w:p>
       <w:pPr>
-        <w:pStyle w:val="berschrift3"/>
+        <w:pStyle w:val="Heading3"/>
         <w:tabs>
           <w:tab w:val="left" w:pos="720"/>
           <w:tab w:val="left" w:pos="1440"/>
@@ -3761,14 +3777,26 @@
         <w:tabs>
           <w:tab w:val="left" w:pos="8607"/>
         </w:tabs>
-      </w:pPr>
-      <w:r>
+        <w:rPr>
+          <w:lang w:val="de-AT"/>
+        </w:rPr>
+      </w:pPr>
+      <w:r>
+        <w:rPr>
+          <w:lang w:val="de-AT"/>
+        </w:rPr>
         <w:t xml:space="preserve">12.1 </w:t>
       </w:r>
       <w:r>
+        <w:rPr>
+          <w:lang w:val="de-AT"/>
+        </w:rPr>
         <w:t>Analyse-Phase</w:t>
       </w:r>
       <w:r>
+        <w:rPr>
+          <w:lang w:val="de-AT"/>
+        </w:rPr>
         <w:tab/>
         <w:t>11</w:t>
       </w:r>
@@ -3778,14 +3806,26 @@
         <w:tabs>
           <w:tab w:val="left" w:pos="8607"/>
         </w:tabs>
-      </w:pPr>
-      <w:r>
+        <w:rPr>
+          <w:lang w:val="de-AT"/>
+        </w:rPr>
+      </w:pPr>
+      <w:r>
+        <w:rPr>
+          <w:lang w:val="de-AT"/>
+        </w:rPr>
         <w:t xml:space="preserve">12.2 </w:t>
       </w:r>
       <w:r>
+        <w:rPr>
+          <w:lang w:val="de-AT"/>
+        </w:rPr>
         <w:t>Research-Phase</w:t>
       </w:r>
       <w:r>
+        <w:rPr>
+          <w:lang w:val="de-AT"/>
+        </w:rPr>
         <w:tab/>
         <w:t>11</w:t>
       </w:r>
@@ -3830,20 +3870,16 @@
         <w:tabs>
           <w:tab w:val="left" w:pos="8607"/>
         </w:tabs>
-        <w:rPr>
-          <w:lang w:val="de-DE"/>
-        </w:rPr>
-      </w:pPr>
-      <w:r>
-        <w:rPr>
-          <w:lang w:val="de-DE"/>
-        </w:rPr>
-        <w:t>12.4 Protoyp</w:t>
-      </w:r>
-      <w:r>
-        <w:rPr>
-          <w:lang w:val="de-DE"/>
-        </w:rPr>
+      </w:pPr>
+      <w:r>
+        <w:t xml:space="preserve">12.4 </w:t>
+      </w:r>
+      <w:proofErr w:type="spellStart"/>
+      <w:r>
+        <w:t>Protoyp</w:t>
+      </w:r>
+      <w:proofErr w:type="spellEnd"/>
+      <w:r>
         <w:tab/>
         <w:t>12</w:t>
       </w:r>
@@ -3853,27 +3889,23 @@
         <w:tabs>
           <w:tab w:val="left" w:pos="8607"/>
         </w:tabs>
-        <w:rPr>
-          <w:lang w:val="de-DE"/>
-        </w:rPr>
-      </w:pPr>
-      <w:r>
-        <w:rPr>
-          <w:lang w:val="de-DE"/>
-        </w:rPr>
-        <w:t>12.5 Dokumentation</w:t>
-      </w:r>
-      <w:r>
-        <w:rPr>
-          <w:lang w:val="de-DE"/>
-        </w:rPr>
+      </w:pPr>
+      <w:r>
+        <w:t xml:space="preserve">12.5 </w:t>
+      </w:r>
+      <w:proofErr w:type="spellStart"/>
+      <w:r>
+        <w:t>Dokumentation</w:t>
+      </w:r>
+      <w:proofErr w:type="spellEnd"/>
+      <w:r>
         <w:tab/>
         <w:t>12</w:t>
       </w:r>
     </w:p>
     <w:p>
       <w:pPr>
-        <w:pStyle w:val="berschrift3"/>
+        <w:pStyle w:val="Heading3"/>
         <w:tabs>
           <w:tab w:val="left" w:pos="720"/>
           <w:tab w:val="left" w:pos="1440"/>
@@ -3881,49 +3913,28 @@
           <w:tab w:val="left" w:pos="8607"/>
         </w:tabs>
         <w:ind w:left="567" w:hanging="567"/>
-        <w:rPr>
-          <w:lang w:val="de-DE"/>
-        </w:rPr>
-      </w:pPr>
-      <w:r>
-        <w:rPr>
-          <w:lang w:val="de-DE"/>
-        </w:rPr>
+      </w:pPr>
+      <w:r>
         <w:t>13</w:t>
       </w:r>
       <w:r>
-        <w:rPr>
-          <w:lang w:val="de-DE"/>
-        </w:rPr>
         <w:tab/>
         <w:t>Project Controls</w:t>
       </w:r>
       <w:r>
-        <w:rPr>
-          <w:lang w:val="de-DE"/>
-        </w:rPr>
-        <w:tab/>
-        <w:t>1</w:t>
-      </w:r>
-      <w:r>
-        <w:rPr>
-          <w:lang w:val="de-DE"/>
-        </w:rPr>
-        <w:t>2</w:t>
-      </w:r>
-    </w:p>
-    <w:p>
-      <w:pPr>
-        <w:pStyle w:val="berschrift3"/>
+        <w:tab/>
+        <w:t>12</w:t>
+      </w:r>
+    </w:p>
+    <w:p>
+      <w:pPr>
+        <w:pStyle w:val="Heading3"/>
         <w:ind w:left="567" w:hanging="567"/>
-        <w:rPr>
-          <w:lang w:val="de-DE"/>
-        </w:rPr>
-      </w:pPr>
-    </w:p>
-    <w:p>
-      <w:pPr>
-        <w:pStyle w:val="berschrift1"/>
+      </w:pPr>
+    </w:p>
+    <w:p>
+      <w:pPr>
+        <w:pStyle w:val="Heading1"/>
         <w:jc w:val="both"/>
       </w:pPr>
       <w:r>
@@ -3990,7 +4001,25 @@
           <w:szCs w:val="24"/>
           <w:lang w:val="de-AT"/>
         </w:rPr>
-        <w:t xml:space="preserve">Im neuen Lager der Leitner AG in Sterzing ist es mühsam und zeitraubend, Artikeldaten wie Maße, Gewicht, Bilder und Codes der Artikel zu erfassen. Kommerzielle Systeme zur Datenaufnahme wie Cubiscan sind einerseits teuer und andererseits zu exakt. Für die Lagerplatzvergabe wäre ein Scanner System ausreichend, welches mobil ist und die grundlegenden Daten automatisiert erfassen kann. </w:t>
+        <w:t xml:space="preserve">Im neuen Lager der Leitner AG in Sterzing ist es mühsam und zeitraubend, Artikeldaten wie Maße, Gewicht, Bilder und Codes der Artikel zu erfassen. Kommerzielle Systeme zur Datenaufnahme wie </w:t>
+      </w:r>
+      <w:proofErr w:type="spellStart"/>
+      <w:r>
+        <w:rPr>
+          <w:sz w:val="24"/>
+          <w:szCs w:val="24"/>
+          <w:lang w:val="de-AT"/>
+        </w:rPr>
+        <w:t>Cubiscan</w:t>
+      </w:r>
+      <w:proofErr w:type="spellEnd"/>
+      <w:r>
+        <w:rPr>
+          <w:sz w:val="24"/>
+          <w:szCs w:val="24"/>
+          <w:lang w:val="de-AT"/>
+        </w:rPr>
+        <w:t xml:space="preserve"> sind einerseits teuer und andererseits zu exakt. Für die Lagerplatzvergabe wäre ein Scanner System ausreichend, welches mobil ist und die grundlegenden Daten automatisiert erfassen kann. </w:t>
       </w:r>
     </w:p>
     <w:p>
@@ -4759,7 +4788,7 @@
     </w:p>
     <w:p>
       <w:pPr>
-        <w:pStyle w:val="berschrift1"/>
+        <w:pStyle w:val="Heading1"/>
         <w:jc w:val="both"/>
         <w:rPr>
           <w:sz w:val="28"/>
@@ -4841,15 +4870,69 @@
           <w:szCs w:val="24"/>
           <w:lang w:val="de-AT"/>
         </w:rPr>
-        <w:t xml:space="preserve">Die Gewichtserfassung erfolgt über Wägezellen, welche in den 4 Ecken platziert werden. Das liegt daran, dass mit 4 Wägezellen das genaueste Ergebnis, unabhängig von der Platzierung vom zu messenden Objekt, erhalten werden kann. </w:t>
-      </w:r>
+        <w:t xml:space="preserve">Die Gewichtserfassung erfolgt über </w:t>
+      </w:r>
+      <w:proofErr w:type="spellStart"/>
       <w:r>
         <w:rPr>
           <w:sz w:val="24"/>
           <w:szCs w:val="24"/>
           <w:lang w:val="de-AT"/>
         </w:rPr>
-        <w:t>Über eine Zusammenschaltung mehrerer zusätzlicher Komponenten kann das Ergebnis der Wägezellen an einen Raspberry Pi per I2C übermittelt werden.</w:t>
+        <w:t>Wägezellen</w:t>
+      </w:r>
+      <w:proofErr w:type="spellEnd"/>
+      <w:r>
+        <w:rPr>
+          <w:sz w:val="24"/>
+          <w:szCs w:val="24"/>
+          <w:lang w:val="de-AT"/>
+        </w:rPr>
+        <w:t xml:space="preserve">, welche in den 4 Ecken platziert werden. Das liegt daran, dass mit 4 </w:t>
+      </w:r>
+      <w:proofErr w:type="spellStart"/>
+      <w:r>
+        <w:rPr>
+          <w:sz w:val="24"/>
+          <w:szCs w:val="24"/>
+          <w:lang w:val="de-AT"/>
+        </w:rPr>
+        <w:t>Wägezellen</w:t>
+      </w:r>
+      <w:proofErr w:type="spellEnd"/>
+      <w:r>
+        <w:rPr>
+          <w:sz w:val="24"/>
+          <w:szCs w:val="24"/>
+          <w:lang w:val="de-AT"/>
+        </w:rPr>
+        <w:t xml:space="preserve"> das genaueste Ergebnis, unabhängig von der Platzierung vom zu messenden Objekt, erhalten werden kann. </w:t>
+      </w:r>
+      <w:r>
+        <w:rPr>
+          <w:sz w:val="24"/>
+          <w:szCs w:val="24"/>
+          <w:lang w:val="de-AT"/>
+        </w:rPr>
+        <w:t xml:space="preserve">Über eine Zusammenschaltung mehrerer zusätzlicher Komponenten kann das Ergebnis der </w:t>
+      </w:r>
+      <w:proofErr w:type="spellStart"/>
+      <w:r>
+        <w:rPr>
+          <w:sz w:val="24"/>
+          <w:szCs w:val="24"/>
+          <w:lang w:val="de-AT"/>
+        </w:rPr>
+        <w:t>Wägezellen</w:t>
+      </w:r>
+      <w:proofErr w:type="spellEnd"/>
+      <w:r>
+        <w:rPr>
+          <w:sz w:val="24"/>
+          <w:szCs w:val="24"/>
+          <w:lang w:val="de-AT"/>
+        </w:rPr>
+        <w:t xml:space="preserve"> an einen Raspberry Pi per I2C übermittelt werden.</w:t>
       </w:r>
     </w:p>
     <w:p>
@@ -5096,7 +5179,7 @@
       <w:commentRangeEnd w:id="2"/>
       <w:r>
         <w:rPr>
-          <w:rStyle w:val="Kommentarzeichen"/>
+          <w:rStyle w:val="CommentReference"/>
           <w:color w:val="auto"/>
         </w:rPr>
         <w:commentReference w:id="2"/>
@@ -5380,19 +5463,60 @@
         </w:rPr>
         <w:t xml:space="preserve"> (</w:t>
       </w:r>
+      <w:proofErr w:type="spellStart"/>
       <w:r>
         <w:rPr>
           <w:color w:val="000000" w:themeColor="text1"/>
           <w:lang w:val="de-DE"/>
         </w:rPr>
-        <w:t xml:space="preserve">Could have, </w:t>
-      </w:r>
+        <w:t>Could</w:t>
+      </w:r>
+      <w:proofErr w:type="spellEnd"/>
       <w:r>
         <w:rPr>
           <w:color w:val="000000" w:themeColor="text1"/>
           <w:lang w:val="de-DE"/>
         </w:rPr>
-        <w:t>Ampel am Bildschirm Must Have)</w:t>
+        <w:t xml:space="preserve"> </w:t>
+      </w:r>
+      <w:proofErr w:type="spellStart"/>
+      <w:r>
+        <w:rPr>
+          <w:color w:val="000000" w:themeColor="text1"/>
+          <w:lang w:val="de-DE"/>
+        </w:rPr>
+        <w:t>have</w:t>
+      </w:r>
+      <w:proofErr w:type="spellEnd"/>
+      <w:r>
+        <w:rPr>
+          <w:color w:val="000000" w:themeColor="text1"/>
+          <w:lang w:val="de-DE"/>
+        </w:rPr>
+        <w:t xml:space="preserve">, </w:t>
+      </w:r>
+      <w:r>
+        <w:rPr>
+          <w:color w:val="000000" w:themeColor="text1"/>
+          <w:lang w:val="de-DE"/>
+        </w:rPr>
+        <w:t xml:space="preserve">Ampel am Bildschirm </w:t>
+      </w:r>
+      <w:proofErr w:type="spellStart"/>
+      <w:r>
+        <w:rPr>
+          <w:color w:val="000000" w:themeColor="text1"/>
+          <w:lang w:val="de-DE"/>
+        </w:rPr>
+        <w:t>Must</w:t>
+      </w:r>
+      <w:proofErr w:type="spellEnd"/>
+      <w:r>
+        <w:rPr>
+          <w:color w:val="000000" w:themeColor="text1"/>
+          <w:lang w:val="de-DE"/>
+        </w:rPr>
+        <w:t xml:space="preserve"> Have)</w:t>
       </w:r>
     </w:p>
     <w:p>
@@ -5512,7 +5636,25 @@
           <w:szCs w:val="24"/>
           <w:lang w:val="de-DE"/>
         </w:rPr>
-        <w:t xml:space="preserve">die einzelnen Komponenten mit Step-Down-Convertern </w:t>
+        <w:t xml:space="preserve">die einzelnen Komponenten mit </w:t>
+      </w:r>
+      <w:proofErr w:type="spellStart"/>
+      <w:r>
+        <w:rPr>
+          <w:sz w:val="24"/>
+          <w:szCs w:val="24"/>
+          <w:lang w:val="de-DE"/>
+        </w:rPr>
+        <w:t>Step</w:t>
+      </w:r>
+      <w:proofErr w:type="spellEnd"/>
+      <w:r>
+        <w:rPr>
+          <w:sz w:val="24"/>
+          <w:szCs w:val="24"/>
+          <w:lang w:val="de-DE"/>
+        </w:rPr>
+        <w:t xml:space="preserve">-Down-Convertern </w:t>
       </w:r>
       <w:r>
         <w:rPr>
@@ -5540,7 +5682,7 @@
     </w:p>
     <w:p>
       <w:pPr>
-        <w:pStyle w:val="berschrift2"/>
+        <w:pStyle w:val="Heading2"/>
         <w:rPr>
           <w:lang w:val="de-DE"/>
         </w:rPr>
@@ -5702,14 +5844,12 @@
         <w:rPr>
           <w:sz w:val="24"/>
           <w:szCs w:val="24"/>
-          <w:lang w:val="de-DE"/>
-        </w:rPr>
-      </w:pPr>
-      <w:r>
-        <w:rPr>
-          <w:sz w:val="24"/>
-          <w:szCs w:val="24"/>
-          <w:lang w:val="de-DE"/>
+        </w:rPr>
+      </w:pPr>
+      <w:r>
+        <w:rPr>
+          <w:sz w:val="24"/>
+          <w:szCs w:val="24"/>
         </w:rPr>
         <w:t xml:space="preserve">- ca. </w:t>
       </w:r>
@@ -5717,7 +5857,6 @@
         <w:rPr>
           <w:sz w:val="24"/>
           <w:szCs w:val="24"/>
-          <w:lang w:val="de-DE"/>
         </w:rPr>
         <w:t>150</w:t>
       </w:r>
@@ -5725,22 +5864,33 @@
         <w:rPr>
           <w:sz w:val="24"/>
           <w:szCs w:val="24"/>
-          <w:lang w:val="de-DE"/>
-        </w:rPr>
-        <w:t xml:space="preserve">€ -&gt; ToF </w:t>
-      </w:r>
-      <w:r>
-        <w:rPr>
-          <w:sz w:val="24"/>
-          <w:szCs w:val="24"/>
-          <w:lang w:val="de-DE"/>
+        </w:rPr>
+        <w:t xml:space="preserve">€ -&gt; </w:t>
+      </w:r>
+      <w:proofErr w:type="spellStart"/>
+      <w:r>
+        <w:rPr>
+          <w:sz w:val="24"/>
+          <w:szCs w:val="24"/>
+        </w:rPr>
+        <w:t>ToF</w:t>
+      </w:r>
+      <w:proofErr w:type="spellEnd"/>
+      <w:r>
+        <w:rPr>
+          <w:sz w:val="24"/>
+          <w:szCs w:val="24"/>
+        </w:rPr>
+        <w:t xml:space="preserve"> </w:t>
+      </w:r>
+      <w:r>
+        <w:rPr>
+          <w:sz w:val="24"/>
+          <w:szCs w:val="24"/>
         </w:rPr>
         <w:t>Kamera</w:t>
       </w:r>
       <w:r>
-        <w:rPr>
-          <w:lang w:val="de-DE"/>
-        </w:rPr>
         <w:tab/>
       </w:r>
     </w:p>
@@ -5754,14 +5904,12 @@
         <w:rPr>
           <w:sz w:val="24"/>
           <w:szCs w:val="24"/>
-          <w:lang w:val="de-DE"/>
-        </w:rPr>
-      </w:pPr>
-      <w:r>
-        <w:rPr>
-          <w:sz w:val="24"/>
-          <w:szCs w:val="24"/>
-          <w:lang w:val="de-DE"/>
+        </w:rPr>
+      </w:pPr>
+      <w:r>
+        <w:rPr>
+          <w:sz w:val="24"/>
+          <w:szCs w:val="24"/>
         </w:rPr>
         <w:t xml:space="preserve">- ca. </w:t>
       </w:r>
@@ -5769,7 +5917,6 @@
         <w:rPr>
           <w:sz w:val="24"/>
           <w:szCs w:val="24"/>
-          <w:lang w:val="de-DE"/>
         </w:rPr>
         <w:t>80</w:t>
       </w:r>
@@ -5777,7 +5924,6 @@
         <w:rPr>
           <w:sz w:val="24"/>
           <w:szCs w:val="24"/>
-          <w:lang w:val="de-DE"/>
         </w:rPr>
         <w:t>€ -&gt; Raspberry Pi</w:t>
       </w:r>
@@ -5838,7 +5984,25 @@
           <w:szCs w:val="24"/>
           <w:lang w:val="de-DE"/>
         </w:rPr>
-        <w:t>Wenn man die Kosten dieses Projekts, also gerundet max. 1000€, mit der alternative dem Cubiscan oder mit den Arbeitsstunden rechnet</w:t>
+        <w:t xml:space="preserve">Wenn man die Kosten dieses Projekts, also gerundet max. 1000€, mit der alternative dem </w:t>
+      </w:r>
+      <w:proofErr w:type="spellStart"/>
+      <w:r>
+        <w:rPr>
+          <w:sz w:val="24"/>
+          <w:szCs w:val="24"/>
+          <w:lang w:val="de-DE"/>
+        </w:rPr>
+        <w:t>Cubiscan</w:t>
+      </w:r>
+      <w:proofErr w:type="spellEnd"/>
+      <w:r>
+        <w:rPr>
+          <w:sz w:val="24"/>
+          <w:szCs w:val="24"/>
+          <w:lang w:val="de-DE"/>
+        </w:rPr>
+        <w:t xml:space="preserve"> oder mit den Arbeitsstunden rechnet</w:t>
       </w:r>
       <w:r>
         <w:rPr>
@@ -5933,10 +6097,7 @@
     </w:p>
     <w:p>
       <w:pPr>
-        <w:pStyle w:val="berschrift2"/>
-        <w:rPr>
-          <w:lang w:val="de-DE"/>
-        </w:rPr>
+        <w:pStyle w:val="Heading2"/>
       </w:pPr>
       <w:r>
         <w:rPr>
@@ -6092,28 +6253,16 @@
         </w:drawing>
       </w:r>
       <w:r>
-        <w:rPr>
-          <w:lang w:val="de-DE"/>
-        </w:rPr>
         <w:t>6</w:t>
       </w:r>
       <w:r>
-        <w:rPr>
-          <w:lang w:val="de-DE"/>
-        </w:rPr>
         <w:tab/>
         <w:t xml:space="preserve">Project </w:t>
       </w:r>
       <w:r>
-        <w:rPr>
-          <w:lang w:val="de-DE"/>
-        </w:rPr>
         <w:t>Management Team</w:t>
       </w:r>
       <w:r>
-        <w:rPr>
-          <w:lang w:val="de-DE"/>
-        </w:rPr>
         <w:t xml:space="preserve"> Structure</w:t>
       </w:r>
     </w:p>
@@ -6122,7 +6271,6 @@
         <w:jc w:val="both"/>
         <w:rPr>
           <w:color w:val="000000"/>
-          <w:lang w:val="de-DE"/>
         </w:rPr>
       </w:pPr>
     </w:p>
@@ -6131,7 +6279,6 @@
         <w:jc w:val="both"/>
         <w:rPr>
           <w:color w:val="000000"/>
-          <w:lang w:val="de-DE"/>
         </w:rPr>
       </w:pPr>
     </w:p>
@@ -6140,33 +6287,20 @@
         <w:jc w:val="both"/>
         <w:rPr>
           <w:color w:val="000000"/>
-          <w:lang w:val="de-DE"/>
-        </w:rPr>
-      </w:pPr>
-    </w:p>
-    <w:p>
-      <w:pPr>
-        <w:pStyle w:val="berschrift2"/>
-        <w:rPr>
-          <w:lang w:val="de-DE"/>
-        </w:rPr>
-      </w:pPr>
-      <w:r>
-        <w:rPr>
-          <w:lang w:val="de-DE"/>
-        </w:rPr>
+        </w:rPr>
+      </w:pPr>
+    </w:p>
+    <w:p>
+      <w:pPr>
+        <w:pStyle w:val="Heading2"/>
+      </w:pPr>
+      <w:r>
         <w:t>7</w:t>
       </w:r>
       <w:r>
-        <w:rPr>
-          <w:lang w:val="de-DE"/>
-        </w:rPr>
-        <w:tab/>
-      </w:r>
-      <w:r>
-        <w:rPr>
-          <w:lang w:val="de-DE"/>
-        </w:rPr>
+        <w:tab/>
+      </w:r>
+      <w:r>
         <w:t>Role Description</w:t>
       </w:r>
     </w:p>
@@ -6197,7 +6331,39 @@
           <w:color w:val="000000" w:themeColor="text1"/>
           <w:lang w:val="de-DE"/>
         </w:rPr>
-        <w:t xml:space="preserve"> und Lieferanten übernehmen die Autoren Schiechtl Alexander und Granegger Felix. Der Lenkausschuss setzt sich aus Ing. Dipl.-Ing. (FH) Bichler Klaus, Gogl Matthias und Perathoner Armin zusammen. Obwohl die </w:t>
+        <w:t xml:space="preserve"> und Lieferanten übernehmen die Autoren Schiechtl Alexander und </w:t>
+      </w:r>
+      <w:proofErr w:type="spellStart"/>
+      <w:r>
+        <w:rPr>
+          <w:color w:val="000000" w:themeColor="text1"/>
+          <w:lang w:val="de-DE"/>
+        </w:rPr>
+        <w:t>Granegger</w:t>
+      </w:r>
+      <w:proofErr w:type="spellEnd"/>
+      <w:r>
+        <w:rPr>
+          <w:color w:val="000000" w:themeColor="text1"/>
+          <w:lang w:val="de-DE"/>
+        </w:rPr>
+        <w:t xml:space="preserve"> Felix. Der Lenkausschuss setzt sich aus Ing. Dipl.-Ing. (FH) Bichler Klaus, </w:t>
+      </w:r>
+      <w:proofErr w:type="spellStart"/>
+      <w:r>
+        <w:rPr>
+          <w:color w:val="000000" w:themeColor="text1"/>
+          <w:lang w:val="de-DE"/>
+        </w:rPr>
+        <w:t>Gogl</w:t>
+      </w:r>
+      <w:proofErr w:type="spellEnd"/>
+      <w:r>
+        <w:rPr>
+          <w:color w:val="000000" w:themeColor="text1"/>
+          <w:lang w:val="de-DE"/>
+        </w:rPr>
+        <w:t xml:space="preserve"> Matthias und Perathoner Armin zusammen. Obwohl die </w:t>
       </w:r>
       <w:r>
         <w:rPr>
@@ -6287,7 +6453,7 @@
     </w:p>
     <w:p>
       <w:pPr>
-        <w:pStyle w:val="berschrift2"/>
+        <w:pStyle w:val="Heading2"/>
         <w:rPr>
           <w:lang w:val="de-DE"/>
         </w:rPr>
@@ -6309,8 +6475,16 @@
         <w:rPr>
           <w:lang w:val="de-DE"/>
         </w:rPr>
-        <w:t>Quality Management Strategy</w:t>
-      </w:r>
+        <w:t xml:space="preserve">Quality Management </w:t>
+      </w:r>
+      <w:proofErr w:type="spellStart"/>
+      <w:r>
+        <w:rPr>
+          <w:lang w:val="de-DE"/>
+        </w:rPr>
+        <w:t>Strategy</w:t>
+      </w:r>
+      <w:proofErr w:type="spellEnd"/>
     </w:p>
     <w:p>
       <w:pPr>
@@ -6416,7 +6590,7 @@
     </w:p>
     <w:p>
       <w:pPr>
-        <w:pStyle w:val="berschrift2"/>
+        <w:pStyle w:val="Heading2"/>
         <w:rPr>
           <w:lang w:val="de-DE"/>
         </w:rPr>
@@ -6433,12 +6607,28 @@
         </w:rPr>
         <w:tab/>
       </w:r>
-      <w:r>
-        <w:rPr>
-          <w:lang w:val="de-DE"/>
-        </w:rPr>
-        <w:t>Configuration Management Strategy</w:t>
-      </w:r>
+      <w:proofErr w:type="spellStart"/>
+      <w:r>
+        <w:rPr>
+          <w:lang w:val="de-DE"/>
+        </w:rPr>
+        <w:t>Configuration</w:t>
+      </w:r>
+      <w:proofErr w:type="spellEnd"/>
+      <w:r>
+        <w:rPr>
+          <w:lang w:val="de-DE"/>
+        </w:rPr>
+        <w:t xml:space="preserve"> Management </w:t>
+      </w:r>
+      <w:proofErr w:type="spellStart"/>
+      <w:r>
+        <w:rPr>
+          <w:lang w:val="de-DE"/>
+        </w:rPr>
+        <w:t>Strategy</w:t>
+      </w:r>
+      <w:proofErr w:type="spellEnd"/>
     </w:p>
     <w:p>
       <w:pPr>
@@ -6512,13 +6702,23 @@
         </w:rPr>
         <w:t xml:space="preserve"> Projektkonfigurationsmanager </w:t>
       </w:r>
-      <w:r>
-        <w:rPr>
-          <w:sz w:val="24"/>
-          <w:szCs w:val="24"/>
-          <w:lang w:val="de-DE"/>
-        </w:rPr>
-        <w:t>Granegger Felix</w:t>
+      <w:proofErr w:type="spellStart"/>
+      <w:r>
+        <w:rPr>
+          <w:sz w:val="24"/>
+          <w:szCs w:val="24"/>
+          <w:lang w:val="de-DE"/>
+        </w:rPr>
+        <w:t>Granegger</w:t>
+      </w:r>
+      <w:proofErr w:type="spellEnd"/>
+      <w:r>
+        <w:rPr>
+          <w:sz w:val="24"/>
+          <w:szCs w:val="24"/>
+          <w:lang w:val="de-DE"/>
+        </w:rPr>
+        <w:t xml:space="preserve"> Felix</w:t>
       </w:r>
       <w:r>
         <w:rPr>
@@ -6662,7 +6862,7 @@
     </w:p>
     <w:p>
       <w:pPr>
-        <w:pStyle w:val="berschrift2"/>
+        <w:pStyle w:val="Heading2"/>
         <w:rPr>
           <w:lang w:val="de-DE"/>
         </w:rPr>
@@ -6683,8 +6883,16 @@
         <w:rPr>
           <w:lang w:val="de-DE"/>
         </w:rPr>
-        <w:t>Risk Management Strategy</w:t>
-      </w:r>
+        <w:t xml:space="preserve">Risk Management </w:t>
+      </w:r>
+      <w:proofErr w:type="spellStart"/>
+      <w:r>
+        <w:rPr>
+          <w:lang w:val="de-DE"/>
+        </w:rPr>
+        <w:t>Strategy</w:t>
+      </w:r>
+      <w:proofErr w:type="spellEnd"/>
     </w:p>
     <w:p>
       <w:pPr>
@@ -6743,7 +6951,7 @@
     </w:p>
     <w:p>
       <w:pPr>
-        <w:pStyle w:val="berschrift2"/>
+        <w:pStyle w:val="Heading2"/>
         <w:rPr>
           <w:lang w:val="de-DE"/>
         </w:rPr>
@@ -6764,8 +6972,16 @@
         <w:rPr>
           <w:lang w:val="de-DE"/>
         </w:rPr>
-        <w:t>Communication Management Strategy</w:t>
-      </w:r>
+        <w:t xml:space="preserve">Communication Management </w:t>
+      </w:r>
+      <w:proofErr w:type="spellStart"/>
+      <w:r>
+        <w:rPr>
+          <w:lang w:val="de-DE"/>
+        </w:rPr>
+        <w:t>Strategy</w:t>
+      </w:r>
+      <w:proofErr w:type="spellEnd"/>
     </w:p>
     <w:p>
       <w:pPr>
@@ -6834,7 +7050,7 @@
     </w:p>
     <w:p>
       <w:pPr>
-        <w:pStyle w:val="berschrift2"/>
+        <w:pStyle w:val="Heading2"/>
         <w:rPr>
           <w:lang w:val="de-DE"/>
         </w:rPr>
@@ -6926,7 +7142,7 @@
     </w:p>
     <w:tbl>
       <w:tblPr>
-        <w:tblStyle w:val="Tabellenraster"/>
+        <w:tblStyle w:val="TableGrid"/>
         <w:tblpPr w:leftFromText="141" w:rightFromText="141" w:vertAnchor="page" w:horzAnchor="margin" w:tblpX="-289" w:tblpY="3814"/>
         <w:tblW w:w="10034" w:type="dxa"/>
         <w:tblBorders>
@@ -7025,64 +7241,6 @@
                 <w:szCs w:val="16"/>
                 <w:lang w:val="de-DE"/>
               </w:rPr>
-              <w:t xml:space="preserve">- </w:t>
-            </w:r>
-            <w:r>
-              <w:rPr>
-                <w:sz w:val="16"/>
-                <w:szCs w:val="16"/>
-                <w:lang w:val="de-DE"/>
-              </w:rPr>
-              <w:t>Was kann gemacht</w:t>
-            </w:r>
-            <w:r>
-              <w:rPr>
-                <w:sz w:val="16"/>
-                <w:szCs w:val="16"/>
-                <w:lang w:val="de-DE"/>
-              </w:rPr>
-              <w:t xml:space="preserve"> </w:t>
-            </w:r>
-            <w:r>
-              <w:rPr>
-                <w:sz w:val="16"/>
-                <w:szCs w:val="16"/>
-                <w:lang w:val="de-DE"/>
-              </w:rPr>
-              <w:br/>
-              <w:t xml:space="preserve"> </w:t>
-            </w:r>
-            <w:r>
-              <w:rPr>
-                <w:sz w:val="16"/>
-                <w:szCs w:val="16"/>
-                <w:lang w:val="de-DE"/>
-              </w:rPr>
-              <w:t xml:space="preserve"> </w:t>
-            </w:r>
-            <w:r>
-              <w:rPr>
-                <w:sz w:val="16"/>
-                <w:szCs w:val="16"/>
-                <w:lang w:val="de-DE"/>
-              </w:rPr>
-              <w:t xml:space="preserve"> </w:t>
-            </w:r>
-            <w:r>
-              <w:rPr>
-                <w:sz w:val="16"/>
-                <w:szCs w:val="16"/>
-                <w:lang w:val="de-DE"/>
-              </w:rPr>
-              <w:t>werden / was nicht</w:t>
-            </w:r>
-            <w:r>
-              <w:rPr>
-                <w:sz w:val="16"/>
-                <w:szCs w:val="16"/>
-                <w:lang w:val="de-DE"/>
-              </w:rPr>
-              <w:br/>
               <w:t>- Risiken w</w:t>
             </w:r>
             <w:r>
@@ -7307,32 +7465,7 @@
                 <w:szCs w:val="16"/>
                 <w:lang w:val="de-DE"/>
               </w:rPr>
-              <w:t xml:space="preserve">sind </w:t>
-            </w:r>
-            <w:r>
-              <w:rPr>
-                <w:sz w:val="16"/>
-                <w:szCs w:val="16"/>
-                <w:lang w:val="de-DE"/>
-              </w:rPr>
-              <w:br/>
-              <w:t xml:space="preserve">   </w:t>
-            </w:r>
-            <w:r>
-              <w:rPr>
-                <w:sz w:val="16"/>
-                <w:szCs w:val="16"/>
-                <w:lang w:val="de-DE"/>
-              </w:rPr>
-              <w:t xml:space="preserve">vollständig </w:t>
-            </w:r>
-            <w:r>
-              <w:rPr>
-                <w:sz w:val="16"/>
-                <w:szCs w:val="16"/>
-                <w:lang w:val="de-DE"/>
-              </w:rPr>
-              <w:t>gemacht</w:t>
+              <w:t>entwickelt</w:t>
             </w:r>
           </w:p>
         </w:tc>
@@ -7496,7 +7629,25 @@
                 <w:lang w:val="de-DE"/>
               </w:rPr>
               <w:br/>
-              <w:t>- Social Media Post</w:t>
+              <w:t xml:space="preserve">- </w:t>
+            </w:r>
+            <w:proofErr w:type="spellStart"/>
+            <w:r>
+              <w:rPr>
+                <w:sz w:val="16"/>
+                <w:szCs w:val="16"/>
+                <w:lang w:val="de-DE"/>
+              </w:rPr>
+              <w:t>Social</w:t>
+            </w:r>
+            <w:proofErr w:type="spellEnd"/>
+            <w:r>
+              <w:rPr>
+                <w:sz w:val="16"/>
+                <w:szCs w:val="16"/>
+                <w:lang w:val="de-DE"/>
+              </w:rPr>
+              <w:t xml:space="preserve"> Media Post</w:t>
             </w:r>
           </w:p>
         </w:tc>
@@ -8102,23 +8253,7 @@
           <w:szCs w:val="24"/>
           <w:lang w:val="de-DE"/>
         </w:rPr>
-        <w:t>Es i</w:t>
-      </w:r>
-      <w:r>
-        <w:rPr>
-          <w:sz w:val="24"/>
-          <w:szCs w:val="24"/>
-          <w:lang w:val="de-DE"/>
-        </w:rPr>
-        <w:t>st klar mit welchen Komponenten das Projekt umgesetzt w</w:t>
-      </w:r>
-      <w:r>
-        <w:rPr>
-          <w:sz w:val="24"/>
-          <w:szCs w:val="24"/>
-          <w:lang w:val="de-DE"/>
-        </w:rPr>
-        <w:t>ird.</w:t>
+        <w:t>Es ist klar mit welchen Komponenten das Projekt umgesetzt wird.</w:t>
       </w:r>
     </w:p>
     <w:p>
@@ -9059,21 +9194,37 @@
           <w:color w:val="000000" w:themeColor="text1"/>
           <w:lang w:val="de-AT"/>
         </w:rPr>
-        <w:t>Am Schluss soll noch ein Social Media Post zu unserer Diplomarbeit erstellt werden.</w:t>
-      </w:r>
-    </w:p>
-    <w:p>
-      <w:pPr>
-        <w:jc w:val="both"/>
+        <w:t xml:space="preserve">Am Schluss soll noch ein </w:t>
+      </w:r>
+      <w:proofErr w:type="spellStart"/>
+      <w:r>
         <w:rPr>
           <w:color w:val="000000" w:themeColor="text1"/>
           <w:lang w:val="de-AT"/>
         </w:rPr>
-      </w:pPr>
-    </w:p>
-    <w:p>
-      <w:pPr>
-        <w:pStyle w:val="berschrift2"/>
+        <w:t>Social</w:t>
+      </w:r>
+      <w:proofErr w:type="spellEnd"/>
+      <w:r>
+        <w:rPr>
+          <w:color w:val="000000" w:themeColor="text1"/>
+          <w:lang w:val="de-AT"/>
+        </w:rPr>
+        <w:t xml:space="preserve"> Media Post zu unserer Diplomarbeit erstellt werden.</w:t>
+      </w:r>
+    </w:p>
+    <w:p>
+      <w:pPr>
+        <w:jc w:val="both"/>
+        <w:rPr>
+          <w:color w:val="000000" w:themeColor="text1"/>
+          <w:lang w:val="de-AT"/>
+        </w:rPr>
+      </w:pPr>
+    </w:p>
+    <w:p>
+      <w:pPr>
+        <w:pStyle w:val="Heading2"/>
         <w:rPr>
           <w:lang w:val="de-DE"/>
         </w:rPr>
@@ -9263,12 +9414,30 @@
           <w:szCs w:val="24"/>
           <w:lang w:val="de-DE"/>
         </w:rPr>
-        <w:t xml:space="preserve"> Die Organisation des Meetings liegt bei Granegger/Schiechtl</w:t>
-      </w:r>
-    </w:p>
-    <w:p>
-      <w:pPr>
-        <w:pStyle w:val="berschrift2"/>
+        <w:t xml:space="preserve"> Die Organisation des Meetings liegt bei </w:t>
+      </w:r>
+      <w:proofErr w:type="spellStart"/>
+      <w:r>
+        <w:rPr>
+          <w:sz w:val="24"/>
+          <w:szCs w:val="24"/>
+          <w:lang w:val="de-DE"/>
+        </w:rPr>
+        <w:t>Granegger</w:t>
+      </w:r>
+      <w:proofErr w:type="spellEnd"/>
+      <w:r>
+        <w:rPr>
+          <w:sz w:val="24"/>
+          <w:szCs w:val="24"/>
+          <w:lang w:val="de-DE"/>
+        </w:rPr>
+        <w:t>/Schiechtl</w:t>
+      </w:r>
+    </w:p>
+    <w:p>
+      <w:pPr>
+        <w:pStyle w:val="Heading2"/>
         <w:rPr>
           <w:lang w:val="de-DE"/>
         </w:rPr>
@@ -9300,11 +9469,11 @@
   <w:comment w:id="2" w:author="SCHIECHTL Alexander" w:date="2025-08-26T08:57:00Z" w:initials="AS">
     <w:p>
       <w:pPr>
-        <w:pStyle w:val="Kommentartext"/>
-      </w:pPr>
-      <w:r>
-        <w:rPr>
-          <w:rStyle w:val="Kommentarzeichen"/>
+        <w:pStyle w:val="CommentText"/>
+      </w:pPr>
+      <w:r>
+        <w:rPr>
+          <w:rStyle w:val="CommentReference"/>
         </w:rPr>
         <w:annotationRef/>
       </w:r>
@@ -9360,7 +9529,7 @@
 <w:ftr xmlns:wpc="http://schemas.microsoft.com/office/word/2010/wordprocessingCanvas" xmlns:cx="http://schemas.microsoft.com/office/drawing/2014/chartex" xmlns:cx1="http://schemas.microsoft.com/office/drawing/2015/9/8/chartex" xmlns:cx2="http://schemas.microsoft.com/office/drawing/2015/10/21/chartex" xmlns:cx3="http://schemas.microsoft.com/office/drawing/2016/5/9/chartex" xmlns:cx4="http://schemas.microsoft.com/office/drawing/2016/5/10/chartex" xmlns:cx5="http://schemas.microsoft.com/office/drawing/2016/5/11/chartex" xmlns:cx6="http://schemas.microsoft.com/office/drawing/2016/5/12/chartex" xmlns:cx7="http://schemas.microsoft.com/office/drawing/2016/5/13/chartex" xmlns:cx8="http://schemas.microsoft.com/office/drawing/2016/5/14/chartex" xmlns:mc="http://schemas.openxmlformats.org/markup-compatibility/2006" xmlns:aink="http://schemas.microsoft.com/office/drawing/2016/ink" xmlns:am3d="http://schemas.microsoft.com/office/drawing/2017/model3d" xmlns:o="urn:schemas-microsoft-com:office:office" xmlns:oel="http://schemas.microsoft.com/office/2019/extlst" xmlns:r="http://schemas.openxmlformats.org/officeDocument/2006/relationships" xmlns:m="http://schemas.openxmlformats.org/officeDocument/2006/math" xmlns:v="urn:schemas-microsoft-com:vml" xmlns:wp14="http://schemas.microsoft.com/office/word/2010/wordprocessingDrawing" xmlns:wp="http://schemas.openxmlformats.org/drawingml/2006/wordprocessingDrawing" xmlns:w10="urn:schemas-microsoft-com:office:word" xmlns:w="http://schemas.openxmlformats.org/wordprocessingml/2006/main" xmlns:w14="http://schemas.microsoft.com/office/word/2010/wordml" xmlns:w15="http://schemas.microsoft.com/office/word/2012/wordml" xmlns:w16cex="http://schemas.microsoft.com/office/word/2018/wordml/cex" xmlns:w16cid="http://schemas.microsoft.com/office/word/2016/wordml/cid" xmlns:w16="http://schemas.microsoft.com/office/word/2018/wordml" xmlns:w16du="http://schemas.microsoft.com/office/word/2023/wordml/word16du" xmlns:w16sdtdh="http://schemas.microsoft.com/office/word/2020/wordml/sdtdatahash" xmlns:w16sdtfl="http://schemas.microsoft.com/office/word/2024/wordml/sdtformatlock" xmlns:w16se="http://schemas.microsoft.com/office/word/2015/wordml/symex" xmlns:wpg="http://schemas.microsoft.com/office/word/2010/wordprocessingGroup" xmlns:wpi="http://schemas.microsoft.com/office/word/2010/wordprocessingInk" xmlns:wne="http://schemas.microsoft.com/office/word/2006/wordml" xmlns:wps="http://schemas.microsoft.com/office/word/2010/wordprocessingShape" mc:Ignorable="w14 w15 w16se w16cid w16 w16cex w16sdtdh w16sdtfl w16du wp14">
   <w:p>
     <w:pPr>
-      <w:pStyle w:val="Fuzeile"/>
+      <w:pStyle w:val="Footer"/>
       <w:ind w:right="360"/>
       <w:jc w:val="right"/>
     </w:pPr>
@@ -9415,7 +9584,7 @@
 <w:hdr xmlns:wpc="http://schemas.microsoft.com/office/word/2010/wordprocessingCanvas" xmlns:cx="http://schemas.microsoft.com/office/drawing/2014/chartex" xmlns:cx1="http://schemas.microsoft.com/office/drawing/2015/9/8/chartex" xmlns:cx2="http://schemas.microsoft.com/office/drawing/2015/10/21/chartex" xmlns:cx3="http://schemas.microsoft.com/office/drawing/2016/5/9/chartex" xmlns:cx4="http://schemas.microsoft.com/office/drawing/2016/5/10/chartex" xmlns:cx5="http://schemas.microsoft.com/office/drawing/2016/5/11/chartex" xmlns:cx6="http://schemas.microsoft.com/office/drawing/2016/5/12/chartex" xmlns:cx7="http://schemas.microsoft.com/office/drawing/2016/5/13/chartex" xmlns:cx8="http://schemas.microsoft.com/office/drawing/2016/5/14/chartex" xmlns:mc="http://schemas.openxmlformats.org/markup-compatibility/2006" xmlns:aink="http://schemas.microsoft.com/office/drawing/2016/ink" xmlns:am3d="http://schemas.microsoft.com/office/drawing/2017/model3d" xmlns:o="urn:schemas-microsoft-com:office:office" xmlns:oel="http://schemas.microsoft.com/office/2019/extlst" xmlns:r="http://schemas.openxmlformats.org/officeDocument/2006/relationships" xmlns:m="http://schemas.openxmlformats.org/officeDocument/2006/math" xmlns:v="urn:schemas-microsoft-com:vml" xmlns:wp14="http://schemas.microsoft.com/office/word/2010/wordprocessingDrawing" xmlns:wp="http://schemas.openxmlformats.org/drawingml/2006/wordprocessingDrawing" xmlns:w10="urn:schemas-microsoft-com:office:word" xmlns:w="http://schemas.openxmlformats.org/wordprocessingml/2006/main" xmlns:w14="http://schemas.microsoft.com/office/word/2010/wordml" xmlns:w15="http://schemas.microsoft.com/office/word/2012/wordml" xmlns:w16cex="http://schemas.microsoft.com/office/word/2018/wordml/cex" xmlns:w16cid="http://schemas.microsoft.com/office/word/2016/wordml/cid" xmlns:w16="http://schemas.microsoft.com/office/word/2018/wordml" xmlns:w16du="http://schemas.microsoft.com/office/word/2023/wordml/word16du" xmlns:w16sdtdh="http://schemas.microsoft.com/office/word/2020/wordml/sdtdatahash" xmlns:w16sdtfl="http://schemas.microsoft.com/office/word/2024/wordml/sdtformatlock" xmlns:w16se="http://schemas.microsoft.com/office/word/2015/wordml/symex" xmlns:wpg="http://schemas.microsoft.com/office/word/2010/wordprocessingGroup" xmlns:wpi="http://schemas.microsoft.com/office/word/2010/wordprocessingInk" xmlns:wne="http://schemas.microsoft.com/office/word/2006/wordml" xmlns:wps="http://schemas.microsoft.com/office/word/2010/wordprocessingShape" mc:Ignorable="w14 w15 w16se w16cid w16 w16cex w16sdtdh w16sdtfl w16du wp14">
   <w:p>
     <w:pPr>
-      <w:pStyle w:val="Kopfzeile"/>
+      <w:pStyle w:val="Header"/>
       <w:jc w:val="center"/>
       <w:rPr>
         <w:color w:val="000000"/>
@@ -9433,7 +9602,7 @@
   </w:p>
   <w:p>
     <w:pPr>
-      <w:pStyle w:val="Kopfzeile"/>
+      <w:pStyle w:val="Header"/>
       <w:tabs>
         <w:tab w:val="clear" w:pos="8306"/>
         <w:tab w:val="right" w:pos="9356"/>
@@ -9448,12 +9617,17 @@
     <w:r>
       <w:tab/>
     </w:r>
+    <w:proofErr w:type="gramStart"/>
     <w:r>
       <w:tab/>
       <w:t xml:space="preserve">  </w:t>
     </w:r>
     <w:r>
-      <w:t xml:space="preserve">Date:  </w:t>
+      <w:t>Date</w:t>
+    </w:r>
+    <w:proofErr w:type="gramEnd"/>
+    <w:r>
+      <w:t xml:space="preserve">:  </w:t>
     </w:r>
     <w:r>
       <w:fldChar w:fldCharType="begin"/>
@@ -9468,7 +9642,7 @@
       <w:rPr>
         <w:noProof/>
       </w:rPr>
-      <w:t>23 September 2025</w:t>
+      <w:t>16 March 2026</w:t>
     </w:r>
     <w:r>
       <w:fldChar w:fldCharType="end"/>
@@ -9476,7 +9650,7 @@
   </w:p>
   <w:p>
     <w:pPr>
-      <w:pStyle w:val="Kopfzeile"/>
+      <w:pStyle w:val="Header"/>
     </w:pPr>
   </w:p>
 </w:hdr>
@@ -10842,7 +11016,7 @@
     <w:lsdException w:name="Unresolved Mention" w:semiHidden="1" w:uiPriority="99" w:unhideWhenUsed="1"/>
     <w:lsdException w:name="Smart Link" w:semiHidden="1" w:uiPriority="99" w:unhideWhenUsed="1"/>
   </w:latentStyles>
-  <w:style w:type="paragraph" w:default="1" w:styleId="Standard">
+  <w:style w:type="paragraph" w:default="1" w:styleId="Normal">
     <w:name w:val="Normal"/>
     <w:qFormat/>
     <w:pPr>
@@ -10858,11 +11032,11 @@
       <w:lang w:val="en-GB" w:eastAsia="en-US"/>
     </w:rPr>
   </w:style>
-  <w:style w:type="paragraph" w:styleId="berschrift1">
+  <w:style w:type="paragraph" w:styleId="Heading1">
     <w:name w:val="heading 1"/>
-    <w:basedOn w:val="Standard"/>
-    <w:next w:val="Standard"/>
-    <w:link w:val="berschrift1Zchn"/>
+    <w:basedOn w:val="Normal"/>
+    <w:next w:val="Normal"/>
+    <w:link w:val="Heading1Char"/>
     <w:qFormat/>
     <w:pPr>
       <w:keepNext/>
@@ -10879,11 +11053,11 @@
       <w:sz w:val="32"/>
     </w:rPr>
   </w:style>
-  <w:style w:type="paragraph" w:styleId="berschrift2">
+  <w:style w:type="paragraph" w:styleId="Heading2">
     <w:name w:val="heading 2"/>
-    <w:basedOn w:val="Standard"/>
-    <w:next w:val="Standard"/>
-    <w:link w:val="berschrift2Zchn"/>
+    <w:basedOn w:val="Normal"/>
+    <w:next w:val="Normal"/>
+    <w:link w:val="Heading2Char"/>
     <w:qFormat/>
     <w:pPr>
       <w:keepNext/>
@@ -10898,11 +11072,11 @@
       <w:sz w:val="28"/>
     </w:rPr>
   </w:style>
-  <w:style w:type="paragraph" w:styleId="berschrift3">
+  <w:style w:type="paragraph" w:styleId="Heading3">
     <w:name w:val="heading 3"/>
-    <w:basedOn w:val="Standard"/>
-    <w:next w:val="Standard"/>
-    <w:link w:val="berschrift3Zchn"/>
+    <w:basedOn w:val="Normal"/>
+    <w:next w:val="Normal"/>
+    <w:link w:val="Heading3Char"/>
     <w:qFormat/>
     <w:pPr>
       <w:keepNext/>
@@ -10913,10 +11087,10 @@
       <w:b/>
     </w:rPr>
   </w:style>
-  <w:style w:type="paragraph" w:styleId="berschrift4">
+  <w:style w:type="paragraph" w:styleId="Heading4">
     <w:name w:val="heading 4"/>
-    <w:basedOn w:val="Standard"/>
-    <w:next w:val="Standard"/>
+    <w:basedOn w:val="Normal"/>
+    <w:next w:val="Normal"/>
     <w:qFormat/>
     <w:pPr>
       <w:keepNext/>
@@ -10927,10 +11101,10 @@
       <w:sz w:val="22"/>
     </w:rPr>
   </w:style>
-  <w:style w:type="paragraph" w:styleId="berschrift5">
+  <w:style w:type="paragraph" w:styleId="Heading5">
     <w:name w:val="heading 5"/>
-    <w:basedOn w:val="Standard"/>
-    <w:next w:val="Standard"/>
+    <w:basedOn w:val="Normal"/>
+    <w:next w:val="Normal"/>
     <w:qFormat/>
     <w:pPr>
       <w:keepNext/>
@@ -10943,10 +11117,10 @@
       <w:lang w:val="en-US"/>
     </w:rPr>
   </w:style>
-  <w:style w:type="paragraph" w:styleId="berschrift6">
+  <w:style w:type="paragraph" w:styleId="Heading6">
     <w:name w:val="heading 6"/>
-    <w:basedOn w:val="Standard"/>
-    <w:next w:val="Standard"/>
+    <w:basedOn w:val="Normal"/>
+    <w:next w:val="Normal"/>
     <w:qFormat/>
     <w:pPr>
       <w:keepNext/>
@@ -10960,10 +11134,10 @@
       <w:lang w:val="en-US"/>
     </w:rPr>
   </w:style>
-  <w:style w:type="paragraph" w:styleId="berschrift7">
+  <w:style w:type="paragraph" w:styleId="Heading7">
     <w:name w:val="heading 7"/>
-    <w:basedOn w:val="Standard"/>
-    <w:next w:val="Standard"/>
+    <w:basedOn w:val="Normal"/>
+    <w:next w:val="Normal"/>
     <w:qFormat/>
     <w:pPr>
       <w:keepNext/>
@@ -10973,10 +11147,10 @@
       <w:i/>
     </w:rPr>
   </w:style>
-  <w:style w:type="paragraph" w:styleId="berschrift8">
+  <w:style w:type="paragraph" w:styleId="Heading8">
     <w:name w:val="heading 8"/>
-    <w:basedOn w:val="Standard"/>
-    <w:next w:val="Standard"/>
+    <w:basedOn w:val="Normal"/>
+    <w:next w:val="Normal"/>
     <w:qFormat/>
     <w:pPr>
       <w:keepNext/>
@@ -10987,10 +11161,10 @@
       <w:b/>
     </w:rPr>
   </w:style>
-  <w:style w:type="paragraph" w:styleId="berschrift9">
+  <w:style w:type="paragraph" w:styleId="Heading9">
     <w:name w:val="heading 9"/>
-    <w:basedOn w:val="Standard"/>
-    <w:next w:val="Standard"/>
+    <w:basedOn w:val="Normal"/>
+    <w:next w:val="Normal"/>
     <w:qFormat/>
     <w:pPr>
       <w:keepNext/>
@@ -11001,13 +11175,13 @@
       <w:sz w:val="28"/>
     </w:rPr>
   </w:style>
-  <w:style w:type="character" w:default="1" w:styleId="Absatz-Standardschriftart">
+  <w:style w:type="character" w:default="1" w:styleId="DefaultParagraphFont">
     <w:name w:val="Default Paragraph Font"/>
     <w:uiPriority w:val="1"/>
     <w:semiHidden/>
     <w:unhideWhenUsed/>
   </w:style>
-  <w:style w:type="table" w:default="1" w:styleId="NormaleTabelle">
+  <w:style w:type="table" w:default="1" w:styleId="TableNormal">
     <w:name w:val="Normal Table"/>
     <w:uiPriority w:val="99"/>
     <w:semiHidden/>
@@ -11022,7 +11196,7 @@
       </w:tblCellMar>
     </w:tblPr>
   </w:style>
-  <w:style w:type="numbering" w:default="1" w:styleId="KeineListe">
+  <w:style w:type="numbering" w:default="1" w:styleId="NoList">
     <w:name w:val="No List"/>
     <w:uiPriority w:val="99"/>
     <w:semiHidden/>
@@ -11030,11 +11204,11 @@
   </w:style>
   <w:style w:type="paragraph" w:customStyle="1" w:styleId="CcList">
     <w:name w:val="Cc List"/>
-    <w:basedOn w:val="Standard"/>
+    <w:basedOn w:val="Normal"/>
   </w:style>
-  <w:style w:type="paragraph" w:styleId="Fuzeile">
+  <w:style w:type="paragraph" w:styleId="Footer">
     <w:name w:val="footer"/>
-    <w:basedOn w:val="Standard"/>
+    <w:basedOn w:val="Normal"/>
     <w:pPr>
       <w:tabs>
         <w:tab w:val="center" w:pos="4153"/>
@@ -11045,9 +11219,9 @@
       <w:sz w:val="16"/>
     </w:rPr>
   </w:style>
-  <w:style w:type="paragraph" w:styleId="Kopfzeile">
+  <w:style w:type="paragraph" w:styleId="Header">
     <w:name w:val="header"/>
-    <w:basedOn w:val="Standard"/>
+    <w:basedOn w:val="Normal"/>
     <w:pPr>
       <w:tabs>
         <w:tab w:val="center" w:pos="4153"/>
@@ -11055,9 +11229,9 @@
       </w:tabs>
     </w:pPr>
   </w:style>
-  <w:style w:type="paragraph" w:styleId="Textkrper">
+  <w:style w:type="paragraph" w:styleId="BodyText">
     <w:name w:val="Body Text"/>
-    <w:basedOn w:val="Standard"/>
+    <w:basedOn w:val="Normal"/>
     <w:pPr>
       <w:tabs>
         <w:tab w:val="left" w:pos="720"/>
@@ -11078,9 +11252,9 @@
       <w:color w:val="FF0000"/>
     </w:rPr>
   </w:style>
-  <w:style w:type="paragraph" w:styleId="Textkrper2">
+  <w:style w:type="paragraph" w:styleId="BodyText2">
     <w:name w:val="Body Text 2"/>
-    <w:basedOn w:val="Standard"/>
+    <w:basedOn w:val="Normal"/>
     <w:pPr>
       <w:jc w:val="both"/>
     </w:pPr>
@@ -11088,9 +11262,9 @@
       <w:color w:val="FF0000"/>
     </w:rPr>
   </w:style>
-  <w:style w:type="paragraph" w:styleId="Textkrper3">
+  <w:style w:type="paragraph" w:styleId="BodyText3">
     <w:name w:val="Body Text 3"/>
-    <w:basedOn w:val="Standard"/>
+    <w:basedOn w:val="Normal"/>
     <w:pPr>
       <w:jc w:val="both"/>
     </w:pPr>
@@ -11099,9 +11273,9 @@
       <w:color w:val="FF0000"/>
     </w:rPr>
   </w:style>
-  <w:style w:type="paragraph" w:styleId="Sprechblasentext">
+  <w:style w:type="paragraph" w:styleId="BalloonText">
     <w:name w:val="Balloon Text"/>
-    <w:basedOn w:val="Standard"/>
+    <w:basedOn w:val="Normal"/>
     <w:rPr>
       <w:rFonts w:ascii="Tahoma" w:hAnsi="Tahoma"/>
       <w:sz w:val="16"/>
@@ -11118,7 +11292,7 @@
   </w:style>
   <w:style w:type="paragraph" w:customStyle="1" w:styleId="listbulletround1">
     <w:name w:val="listbulletround1"/>
-    <w:basedOn w:val="Standard"/>
+    <w:basedOn w:val="Normal"/>
     <w:rsid w:val="0070338C"/>
     <w:pPr>
       <w:numPr>
@@ -11138,7 +11312,7 @@
   </w:style>
   <w:style w:type="paragraph" w:customStyle="1" w:styleId="listbulletdash2">
     <w:name w:val="listbulletdash2"/>
-    <w:basedOn w:val="Standard"/>
+    <w:basedOn w:val="Normal"/>
     <w:rsid w:val="00396DDC"/>
     <w:pPr>
       <w:numPr>
@@ -11155,9 +11329,9 @@
       <w:sz w:val="20"/>
     </w:rPr>
   </w:style>
-  <w:style w:type="character" w:customStyle="1" w:styleId="berschrift1Zchn">
-    <w:name w:val="Überschrift 1 Zchn"/>
-    <w:link w:val="berschrift1"/>
+  <w:style w:type="character" w:customStyle="1" w:styleId="Heading1Char">
+    <w:name w:val="Heading 1 Char"/>
+    <w:link w:val="Heading1"/>
     <w:rsid w:val="00675410"/>
     <w:rPr>
       <w:rFonts w:ascii="Arial" w:hAnsi="Arial"/>
@@ -11167,9 +11341,9 @@
       <w:lang w:val="en-GB" w:eastAsia="en-US"/>
     </w:rPr>
   </w:style>
-  <w:style w:type="character" w:customStyle="1" w:styleId="berschrift2Zchn">
-    <w:name w:val="Überschrift 2 Zchn"/>
-    <w:link w:val="berschrift2"/>
+  <w:style w:type="character" w:customStyle="1" w:styleId="Heading2Char">
+    <w:name w:val="Heading 2 Char"/>
+    <w:link w:val="Heading2"/>
     <w:rsid w:val="00675410"/>
     <w:rPr>
       <w:rFonts w:ascii="Arial" w:hAnsi="Arial"/>
@@ -11178,9 +11352,9 @@
       <w:lang w:val="en-GB" w:eastAsia="en-US"/>
     </w:rPr>
   </w:style>
-  <w:style w:type="character" w:customStyle="1" w:styleId="berschrift3Zchn">
-    <w:name w:val="Überschrift 3 Zchn"/>
-    <w:link w:val="berschrift3"/>
+  <w:style w:type="character" w:customStyle="1" w:styleId="Heading3Char">
+    <w:name w:val="Heading 3 Char"/>
+    <w:link w:val="Heading3"/>
     <w:rsid w:val="00675410"/>
     <w:rPr>
       <w:rFonts w:ascii="Arial" w:hAnsi="Arial"/>
@@ -11189,18 +11363,18 @@
       <w:lang w:val="en-GB" w:eastAsia="en-US"/>
     </w:rPr>
   </w:style>
-  <w:style w:type="paragraph" w:styleId="StandardWeb">
+  <w:style w:type="paragraph" w:styleId="NormalWeb">
     <w:name w:val="Normal (Web)"/>
-    <w:basedOn w:val="Standard"/>
+    <w:basedOn w:val="Normal"/>
     <w:rsid w:val="0078187E"/>
     <w:rPr>
       <w:rFonts w:ascii="Times New Roman" w:hAnsi="Times New Roman"/>
       <w:szCs w:val="24"/>
     </w:rPr>
   </w:style>
-  <w:style w:type="table" w:styleId="Tabellenraster">
+  <w:style w:type="table" w:styleId="TableGrid">
     <w:name w:val="Table Grid"/>
-    <w:basedOn w:val="NormaleTabelle"/>
+    <w:basedOn w:val="TableNormal"/>
     <w:rsid w:val="00DD4341"/>
     <w:tblPr>
       <w:tblBorders>
@@ -11215,16 +11389,16 @@
   </w:style>
   <w:style w:type="character" w:styleId="Hyperlink">
     <w:name w:val="Hyperlink"/>
-    <w:basedOn w:val="Absatz-Standardschriftart"/>
+    <w:basedOn w:val="DefaultParagraphFont"/>
     <w:rsid w:val="004040F1"/>
     <w:rPr>
       <w:color w:val="0563C1" w:themeColor="hyperlink"/>
       <w:u w:val="single"/>
     </w:rPr>
   </w:style>
-  <w:style w:type="character" w:styleId="NichtaufgelsteErwhnung">
+  <w:style w:type="character" w:styleId="UnresolvedMention">
     <w:name w:val="Unresolved Mention"/>
-    <w:basedOn w:val="Absatz-Standardschriftart"/>
+    <w:basedOn w:val="DefaultParagraphFont"/>
     <w:uiPriority w:val="99"/>
     <w:semiHidden/>
     <w:unhideWhenUsed/>
@@ -11234,58 +11408,58 @@
       <w:shd w:val="clear" w:color="auto" w:fill="E1DFDD"/>
     </w:rPr>
   </w:style>
-  <w:style w:type="character" w:styleId="BesuchterLink">
+  <w:style w:type="character" w:styleId="FollowedHyperlink">
     <w:name w:val="FollowedHyperlink"/>
-    <w:basedOn w:val="Absatz-Standardschriftart"/>
+    <w:basedOn w:val="DefaultParagraphFont"/>
     <w:rsid w:val="004040F1"/>
     <w:rPr>
       <w:color w:val="954F72" w:themeColor="followedHyperlink"/>
       <w:u w:val="single"/>
     </w:rPr>
   </w:style>
-  <w:style w:type="character" w:styleId="Kommentarzeichen">
+  <w:style w:type="character" w:styleId="CommentReference">
     <w:name w:val="annotation reference"/>
-    <w:basedOn w:val="Absatz-Standardschriftart"/>
+    <w:basedOn w:val="DefaultParagraphFont"/>
     <w:rsid w:val="00D81F24"/>
     <w:rPr>
       <w:sz w:val="16"/>
       <w:szCs w:val="16"/>
     </w:rPr>
   </w:style>
-  <w:style w:type="paragraph" w:styleId="Kommentartext">
+  <w:style w:type="paragraph" w:styleId="CommentText">
     <w:name w:val="annotation text"/>
-    <w:basedOn w:val="Standard"/>
-    <w:link w:val="KommentartextZchn"/>
+    <w:basedOn w:val="Normal"/>
+    <w:link w:val="CommentTextChar"/>
     <w:rsid w:val="00D81F24"/>
     <w:rPr>
       <w:sz w:val="20"/>
     </w:rPr>
   </w:style>
-  <w:style w:type="character" w:customStyle="1" w:styleId="KommentartextZchn">
-    <w:name w:val="Kommentartext Zchn"/>
-    <w:basedOn w:val="Absatz-Standardschriftart"/>
-    <w:link w:val="Kommentartext"/>
+  <w:style w:type="character" w:customStyle="1" w:styleId="CommentTextChar">
+    <w:name w:val="Comment Text Char"/>
+    <w:basedOn w:val="DefaultParagraphFont"/>
+    <w:link w:val="CommentText"/>
     <w:rsid w:val="00D81F24"/>
     <w:rPr>
       <w:rFonts w:ascii="Arial" w:hAnsi="Arial"/>
       <w:lang w:val="en-GB" w:eastAsia="en-US"/>
     </w:rPr>
   </w:style>
-  <w:style w:type="paragraph" w:styleId="Kommentarthema">
+  <w:style w:type="paragraph" w:styleId="CommentSubject">
     <w:name w:val="annotation subject"/>
-    <w:basedOn w:val="Kommentartext"/>
-    <w:next w:val="Kommentartext"/>
-    <w:link w:val="KommentarthemaZchn"/>
+    <w:basedOn w:val="CommentText"/>
+    <w:next w:val="CommentText"/>
+    <w:link w:val="CommentSubjectChar"/>
     <w:rsid w:val="00D81F24"/>
     <w:rPr>
       <w:b/>
       <w:bCs/>
     </w:rPr>
   </w:style>
-  <w:style w:type="character" w:customStyle="1" w:styleId="KommentarthemaZchn">
-    <w:name w:val="Kommentarthema Zchn"/>
-    <w:basedOn w:val="KommentartextZchn"/>
-    <w:link w:val="Kommentarthema"/>
+  <w:style w:type="character" w:customStyle="1" w:styleId="CommentSubjectChar">
+    <w:name w:val="Comment Subject Char"/>
+    <w:basedOn w:val="CommentTextChar"/>
+    <w:link w:val="CommentSubject"/>
     <w:rsid w:val="00D81F24"/>
     <w:rPr>
       <w:rFonts w:ascii="Arial" w:hAnsi="Arial"/>
@@ -14612,6 +14786,14 @@
 </file>
 
 <file path=customXml/item1.xml><?xml version="1.0" encoding="utf-8"?>
+<LongProperties xmlns="http://schemas.microsoft.com/office/2006/metadata/longProperties"/>
+</file>
+
+<file path=customXml/item2.xml><?xml version="1.0" encoding="utf-8"?>
+<b:Sources xmlns:b="http://schemas.openxmlformats.org/officeDocument/2006/bibliography" xmlns="http://schemas.openxmlformats.org/officeDocument/2006/bibliography" SelectedStyle="\APASixthEditionOfficeOnline.xsl" StyleName="APA" Version="6"/>
+</file>
+
+<file path=customXml/item3.xml><?xml version="1.0" encoding="utf-8"?>
 <p:properties xmlns:p="http://schemas.microsoft.com/office/2006/metadata/properties" xmlns:xsi="http://www.w3.org/2001/XMLSchema-instance" xmlns:pc="http://schemas.microsoft.com/office/infopath/2007/PartnerControls">
   <documentManagement>
     <lcf76f155ced4ddcb4097134ff3c332f xmlns="dada195d-2b4c-422f-a5d1-90c4a3de233f">
@@ -14621,15 +14803,16 @@
 </p:properties>
 </file>
 
-<file path=customXml/item2.xml><?xml version="1.0" encoding="utf-8"?>
-<b:Sources xmlns:b="http://schemas.openxmlformats.org/officeDocument/2006/bibliography" xmlns="http://schemas.openxmlformats.org/officeDocument/2006/bibliography" SelectedStyle="\APASixthEditionOfficeOnline.xsl" StyleName="APA" Version="6"/>
+<file path=customXml/item4.xml><?xml version="1.0" encoding="utf-8"?>
+<?mso-contentType ?>
+<FormTemplates xmlns="http://schemas.microsoft.com/sharepoint/v3/contenttype/forms">
+  <Display>DocumentLibraryForm</Display>
+  <Edit>DocumentLibraryForm</Edit>
+  <New>DocumentLibraryForm</New>
+</FormTemplates>
 </file>
 
-<file path=customXml/item3.xml><?xml version="1.0" encoding="utf-8"?>
-<LongProperties xmlns="http://schemas.microsoft.com/office/2006/metadata/longProperties"/>
-</file>
-
-<file path=customXml/item4.xml><?xml version="1.0" encoding="utf-8"?>
+<file path=customXml/item5.xml><?xml version="1.0" encoding="utf-8"?>
 <ct:contentTypeSchema xmlns:ct="http://schemas.microsoft.com/office/2006/metadata/contentType" xmlns:ma="http://schemas.microsoft.com/office/2006/metadata/properties/metaAttributes" ct:_="" ma:_="" ma:contentTypeName="Dokument" ma:contentTypeID="0x010100B16B4D4BCD437D448872317F95B506B0" ma:contentTypeVersion="9" ma:contentTypeDescription="Ein neues Dokument erstellen." ma:contentTypeScope="" ma:versionID="c990f9f4254d28aba9a8881f7d69d4ad">
   <xsd:schema xmlns:xsd="http://www.w3.org/2001/XMLSchema" xmlns:xs="http://www.w3.org/2001/XMLSchema" xmlns:p="http://schemas.microsoft.com/office/2006/metadata/properties" xmlns:ns2="dada195d-2b4c-422f-a5d1-90c4a3de233f" targetNamespace="http://schemas.microsoft.com/office/2006/metadata/properties" ma:root="true" ma:fieldsID="7317f5e33d97189194428c3135c81341" ns2:_="">
     <xsd:import namespace="dada195d-2b4c-422f-a5d1-90c4a3de233f"/>
@@ -14801,21 +14984,10 @@
 </ct:contentTypeSchema>
 </file>
 
-<file path=customXml/item5.xml><?xml version="1.0" encoding="utf-8"?>
-<?mso-contentType ?>
-<FormTemplates xmlns="http://schemas.microsoft.com/sharepoint/v3/contenttype/forms">
-  <Display>DocumentLibraryForm</Display>
-  <Edit>DocumentLibraryForm</Edit>
-  <New>DocumentLibraryForm</New>
-</FormTemplates>
-</file>
-
 <file path=customXml/itemProps1.xml><?xml version="1.0" encoding="utf-8"?>
-<ds:datastoreItem xmlns:ds="http://schemas.openxmlformats.org/officeDocument/2006/customXml" ds:itemID="{035D9036-1411-492A-912D-8F3F74FF11BD}">
+<ds:datastoreItem xmlns:ds="http://schemas.openxmlformats.org/officeDocument/2006/customXml" ds:itemID="{65350706-3168-41D2-A2B3-0332DD2479A8}">
   <ds:schemaRefs>
-    <ds:schemaRef ds:uri="http://schemas.microsoft.com/office/2006/metadata/properties"/>
-    <ds:schemaRef ds:uri="http://schemas.microsoft.com/office/infopath/2007/PartnerControls"/>
-    <ds:schemaRef ds:uri="dada195d-2b4c-422f-a5d1-90c4a3de233f"/>
+    <ds:schemaRef ds:uri="http://schemas.microsoft.com/office/2006/metadata/longProperties"/>
   </ds:schemaRefs>
 </ds:datastoreItem>
 </file>
@@ -14829,21 +15001,37 @@
 </file>
 
 <file path=customXml/itemProps3.xml><?xml version="1.0" encoding="utf-8"?>
-<ds:datastoreItem xmlns:ds="http://schemas.openxmlformats.org/officeDocument/2006/customXml" ds:itemID="{65350706-3168-41D2-A2B3-0332DD2479A8}">
+<ds:datastoreItem xmlns:ds="http://schemas.openxmlformats.org/officeDocument/2006/customXml" ds:itemID="{035D9036-1411-492A-912D-8F3F74FF11BD}">
   <ds:schemaRefs>
-    <ds:schemaRef ds:uri="http://schemas.microsoft.com/office/2006/metadata/longProperties"/>
+    <ds:schemaRef ds:uri="http://schemas.microsoft.com/office/2006/metadata/properties"/>
+    <ds:schemaRef ds:uri="http://schemas.microsoft.com/office/infopath/2007/PartnerControls"/>
+    <ds:schemaRef ds:uri="dada195d-2b4c-422f-a5d1-90c4a3de233f"/>
   </ds:schemaRefs>
 </ds:datastoreItem>
 </file>
 
 <file path=customXml/itemProps4.xml><?xml version="1.0" encoding="utf-8"?>
-<ds:datastoreItem xmlns:ds="http://schemas.openxmlformats.org/officeDocument/2006/customXml" ds:itemID="{188FE5A3-743D-47F4-BEA9-32099A6FCD67}"/>
-</file>
-
-<file path=customXml/itemProps5.xml><?xml version="1.0" encoding="utf-8"?>
 <ds:datastoreItem xmlns:ds="http://schemas.openxmlformats.org/officeDocument/2006/customXml" ds:itemID="{4820FA48-4932-4B24-891B-7D8B30C1005F}">
   <ds:schemaRefs>
     <ds:schemaRef ds:uri="http://schemas.microsoft.com/sharepoint/v3/contenttype/forms"/>
   </ds:schemaRefs>
 </ds:datastoreItem>
+</file>
+
+<file path=customXml/itemProps5.xml><?xml version="1.0" encoding="utf-8"?>
+<ds:datastoreItem xmlns:ds="http://schemas.openxmlformats.org/officeDocument/2006/customXml" ds:itemID="{188FE5A3-743D-47F4-BEA9-32099A6FCD67}">
+  <ds:schemaRefs>
+    <ds:schemaRef ds:uri="http://schemas.microsoft.com/office/2006/metadata/contentType"/>
+    <ds:schemaRef ds:uri="http://schemas.microsoft.com/office/2006/metadata/properties/metaAttributes"/>
+    <ds:schemaRef ds:uri="http://www.w3.org/2001/XMLSchema"/>
+    <ds:schemaRef ds:uri="http://schemas.microsoft.com/office/2006/metadata/properties"/>
+    <ds:schemaRef ds:uri="dada195d-2b4c-422f-a5d1-90c4a3de233f"/>
+    <ds:schemaRef ds:uri="http://schemas.microsoft.com/office/2006/documentManagement/types"/>
+    <ds:schemaRef ds:uri="http://schemas.microsoft.com/office/infopath/2007/PartnerControls"/>
+    <ds:schemaRef ds:uri="http://schemas.openxmlformats.org/package/2006/metadata/core-properties"/>
+    <ds:schemaRef ds:uri="http://purl.org/dc/elements/1.1/"/>
+    <ds:schemaRef ds:uri="http://purl.org/dc/terms/"/>
+    <ds:schemaRef ds:uri="http://schemas.microsoft.com/internal/obd"/>
+  </ds:schemaRefs>
+</ds:datastoreItem>
 </file>
</xml_diff>